<commit_message>
docs: rework mockup to match real UI — Windows frame + white rail + sage accents
User feedback: mockup should look like an actual window view and match
the real app more exactly. The first pass used macOS traffic lights and
a dark rail, neither of which matches RxStation.

Rework:
- Windows 11 title bar (min / max / close on the right)
- White rail with the real RxStation palette — warm off-white bg
  (#F6F5F2), sage-green primary (#8AA380) for active state + Print
  button, pale green (#F1F5F0) for the active nav row
- Full nav: Drug Enquiry + Work / Data / System sections, F1/F2/F3
  badges, correct order
- Top bar with breadcrumb, search, and the green "● IP/OP" chip
- View head with the real subtitle string
- Card shows the loaded-drug state so all four numbered callouts are
  meaningful: active tab, scan input, Print Label, Clear
</commit_message>
<xml_diff>
--- a/doc/RxStation UserGuide.docx
+++ b/doc/RxStation UserGuide.docx
@@ -488,7 +488,7 @@
       <w:r>
         <w:drawing>
           <wp:inline>
-            <wp:extent cx="5334000" cy="3556000"/>
+            <wp:extent cx="5334000" cy="3627120"/>
             <wp:effectExtent b="0" l="0" r="0" t="0"/>
             <wp:docPr descr="Small Label Print — Standard Label tab" title="" id="25" name="Picture"/>
             <a:graphic>
@@ -509,7 +509,7 @@
                   <pic:spPr bwMode="auto">
                     <a:xfrm>
                       <a:off x="0" y="0"/>
-                      <a:ext cx="5334000" cy="3556000"/>
+                      <a:ext cx="5334000" cy="3627120"/>
                     </a:xfrm>
                     <a:prstGeom prst="rect">
                       <a:avLst/>

</xml_diff>